<commit_message>
chore(audit): fecha FINDING-FOOTER-001..008, regenera artefatos e atualiza checklist (2026-08-14)
</commit_message>
<xml_diff>
--- a/TEMPLATE_Manual - Formato padrao.docx
+++ b/TEMPLATE_Manual - Formato padrao.docx
@@ -26,6 +26,7 @@
     </w:p>
     <w:p>
       <w:pPr>
+        <w:pStyle w:val="ufla_capa_autor"/>
         <w:spacing w:after="0" w:line="240"/>
         <w:jc w:val="center"/>
       </w:pPr>
@@ -48,6 +49,7 @@
     </w:p>
     <w:p>
       <w:pPr>
+        <w:pStyle w:val="ufla_capa_titulo"/>
         <w:spacing w:after="0" w:line="360"/>
         <w:jc w:val="center"/>
       </w:pPr>
@@ -70,6 +72,7 @@
     </w:p>
     <w:p>
       <w:pPr>
+        <w:pStyle w:val="ufla_capa_local_ano"/>
         <w:spacing w:after="120" w:line="240"/>
         <w:jc w:val="center"/>
       </w:pPr>
@@ -87,6 +90,7 @@
     </w:p>
     <w:p>
       <w:pPr>
+        <w:pStyle w:val="ufla_capa_local_ano"/>
         <w:spacing w:after="0" w:line="240"/>
         <w:jc w:val="center"/>
       </w:pPr>
@@ -109,6 +113,7 @@
     </w:p>
     <w:p>
       <w:pPr>
+        <w:pStyle w:val="ufla_folha_rosto_autor"/>
         <w:spacing w:after="0" w:line="240"/>
         <w:jc w:val="center"/>
       </w:pPr>
@@ -131,6 +136,7 @@
     </w:p>
     <w:p>
       <w:pPr>
+        <w:pStyle w:val="ufla_folha_rosto_titulo"/>
         <w:spacing w:after="0" w:line="360"/>
         <w:jc w:val="center"/>
       </w:pPr>
@@ -153,6 +159,7 @@
     </w:p>
     <w:p>
       <w:pPr>
+        <w:pStyle w:val="ufla_natureza"/>
         <w:spacing w:line="240" w:after="180"/>
         <w:ind w:left="2268"/>
         <w:jc w:val="both"/>
@@ -230,7 +237,8 @@
     </w:p>
     <w:p>
       <w:pPr>
-        <w:spacing w:before="240" w:after="240" w:line="360"/>
+        <w:pStyle w:val="ufla_titulo_sem_indicativo"/>
+        <w:spacing w:before="240" w:after="240" w:line="240"/>
         <w:jc w:val="center"/>
       </w:pPr>
       <w:r>
@@ -247,6 +255,7 @@
     </w:p>
     <w:p>
       <w:pPr>
+        <w:pStyle w:val="ufla_corpo_texto"/>
         <w:spacing w:line="240" w:after="0"/>
         <w:jc w:val="both"/>
       </w:pPr>
@@ -306,6 +315,7 @@
     </w:p>
     <w:p>
       <w:pPr>
+        <w:pStyle w:val="ufla_natureza"/>
         <w:spacing w:line="240" w:after="180"/>
         <w:ind w:left="2268"/>
         <w:jc w:val="both"/>
@@ -411,13 +421,10 @@
       </w:r>
     </w:p>
     <w:p>
-      <w:r>
-        <w:br w:type="page"/>
-      </w:r>
-    </w:p>
-    <w:p>
-      <w:pPr>
-        <w:spacing w:before="240" w:after="240" w:line="360"/>
+      <w:pPr>
+        <w:pStyle w:val="ufla_titulo_sem_indicativo"/>
+        <w:pageBreakBefore/>
+        <w:spacing w:before="240" w:after="240" w:line="240"/>
         <w:jc w:val="center"/>
       </w:pPr>
       <w:r>
@@ -434,6 +441,7 @@
     </w:p>
     <w:p>
       <w:pPr>
+        <w:pStyle w:val="ufla_resumo"/>
         <w:spacing w:line="240" w:after="0"/>
         <w:jc w:val="both"/>
       </w:pPr>
@@ -449,6 +457,44 @@
     </w:p>
     <w:p>
       <w:pPr>
+        <w:pStyle w:val="ufla_palavras_chave"/>
+        <w:spacing w:line="360" w:after="0"/>
+        <w:ind w:firstLine="709"/>
+        <w:jc w:val="both"/>
+      </w:pPr>
+      <w:r>
+        <w:rPr>
+          <w:b/>
+          <w:bCs/>
+        </w:rPr>
+        <w:t xml:space="preserve">Palavras-chave: </w:t>
+      </w:r>
+      <w:r>
+        <w:t xml:space="preserve">resumo; template; UFLA; normalização.</w:t>
+      </w:r>
+    </w:p>
+    <w:p>
+      <w:pPr>
+        <w:pStyle w:val="ufla_titulo_sem_indicativo"/>
+        <w:pageBreakBefore/>
+        <w:spacing w:before="240" w:after="240" w:line="240"/>
+        <w:jc w:val="center"/>
+      </w:pPr>
+      <w:r>
+        <w:rPr>
+          <w:b/>
+          <w:bCs/>
+          <w:color w:val="000000"/>
+          <w:sz w:val="24"/>
+          <w:szCs w:val="24"/>
+          <w:rFonts w:ascii="Times New Roman" w:cs="Times New Roman" w:eastAsia="Times New Roman" w:hAnsi="Times New Roman"/>
+        </w:rPr>
+        <w:t xml:space="preserve">ABSTRACT</w:t>
+      </w:r>
+    </w:p>
+    <w:p>
+      <w:pPr>
+        <w:pStyle w:val="ufla_abstract"/>
         <w:spacing w:line="240" w:after="0"/>
         <w:jc w:val="both"/>
       </w:pPr>
@@ -459,33 +505,41 @@
           <w:szCs w:val="24"/>
           <w:rFonts w:ascii="Times New Roman" w:cs="Times New Roman" w:eastAsia="Times New Roman" w:hAnsi="Times New Roman"/>
         </w:rPr>
-        <w:t xml:space="preserve">Palavras-chave: resumo; template; UFLA; normalização.</w:t>
-      </w:r>
-    </w:p>
-    <w:p>
-      <w:r>
-        <w:br w:type="page"/>
-      </w:r>
-    </w:p>
-    <w:p>
-      <w:pPr>
-        <w:spacing w:before="240" w:after="240" w:line="360"/>
-        <w:jc w:val="center"/>
-      </w:pPr>
-      <w:r>
-        <w:rPr>
-          <w:b/>
-          <w:bCs/>
-          <w:color w:val="000000"/>
-          <w:sz w:val="24"/>
-          <w:szCs w:val="24"/>
-          <w:rFonts w:ascii="Times New Roman" w:cs="Times New Roman" w:eastAsia="Times New Roman" w:hAnsi="Times New Roman"/>
-        </w:rPr>
-        <w:t xml:space="preserve">ABSTRACT</w:t>
-      </w:r>
-    </w:p>
-    <w:p>
-      <w:pPr>
+        <w:t xml:space="preserve">The abstract should contain between 150 and 500 words. This is a sample abstract for the UFLA template.</w:t>
+      </w:r>
+    </w:p>
+    <w:p>
+      <w:pPr>
+        <w:pStyle w:val="ufla_keywords"/>
+        <w:spacing w:line="360" w:after="0"/>
+        <w:jc w:val="both"/>
+      </w:pPr>
+      <w:r>
+        <w:t xml:space="preserve">Keywords: summary; template; UFLA; standardization.</w:t>
+      </w:r>
+    </w:p>
+    <w:p>
+      <w:pPr>
+        <w:pStyle w:val="ufla_titulo_sem_indicativo"/>
+        <w:pageBreakBefore/>
+        <w:spacing w:before="240" w:after="240" w:line="240"/>
+        <w:jc w:val="center"/>
+      </w:pPr>
+      <w:r>
+        <w:rPr>
+          <w:b/>
+          <w:bCs/>
+          <w:color w:val="000000"/>
+          <w:sz w:val="24"/>
+          <w:szCs w:val="24"/>
+          <w:rFonts w:ascii="Times New Roman" w:cs="Times New Roman" w:eastAsia="Times New Roman" w:hAnsi="Times New Roman"/>
+        </w:rPr>
+        <w:t xml:space="preserve">INDICADORES DE IMPACTO</w:t>
+      </w:r>
+    </w:p>
+    <w:p>
+      <w:pPr>
+        <w:pStyle w:val="ufla_corpo_texto"/>
         <w:spacing w:line="240" w:after="0"/>
         <w:jc w:val="both"/>
       </w:pPr>
@@ -496,22 +550,7 @@
           <w:szCs w:val="24"/>
           <w:rFonts w:ascii="Times New Roman" w:cs="Times New Roman" w:eastAsia="Times New Roman" w:hAnsi="Times New Roman"/>
         </w:rPr>
-        <w:t xml:space="preserve">The abstract should contain between 150 and 500 words. This is a sample abstract for the UFLA template.</w:t>
-      </w:r>
-    </w:p>
-    <w:p>
-      <w:pPr>
-        <w:spacing w:line="240" w:after="0"/>
-        <w:jc w:val="both"/>
-      </w:pPr>
-      <w:r>
-        <w:rPr>
-          <w:color w:val="000000"/>
-          <w:sz w:val="24"/>
-          <w:szCs w:val="24"/>
-          <w:rFonts w:ascii="Times New Roman" w:cs="Times New Roman" w:eastAsia="Times New Roman" w:hAnsi="Times New Roman"/>
-        </w:rPr>
-        <w:t xml:space="preserve">Keywords: summary; template; UFLA; standardization.</w:t>
+        <w:t xml:space="preserve">Indicadores de impacto não preenchidos. Consulte o Manual UFLA 6ª ed. p. 51 para orientações sobre este elemento obrigatório.</w:t>
       </w:r>
     </w:p>
     <w:p>
@@ -521,44 +560,8 @@
     </w:p>
     <w:p>
       <w:pPr>
-        <w:spacing w:before="240" w:after="240" w:line="360"/>
-        <w:jc w:val="center"/>
-      </w:pPr>
-      <w:r>
-        <w:rPr>
-          <w:b/>
-          <w:bCs/>
-          <w:color w:val="000000"/>
-          <w:sz w:val="24"/>
-          <w:szCs w:val="24"/>
-          <w:rFonts w:ascii="Times New Roman" w:cs="Times New Roman" w:eastAsia="Times New Roman" w:hAnsi="Times New Roman"/>
-        </w:rPr>
-        <w:t xml:space="preserve">INDICADORES DE IMPACTO</w:t>
-      </w:r>
-    </w:p>
-    <w:p>
-      <w:pPr>
-        <w:spacing w:line="240" w:after="0"/>
-        <w:jc w:val="both"/>
-      </w:pPr>
-      <w:r>
-        <w:rPr>
-          <w:color w:val="000000"/>
-          <w:sz w:val="24"/>
-          <w:szCs w:val="24"/>
-          <w:rFonts w:ascii="Times New Roman" w:cs="Times New Roman" w:eastAsia="Times New Roman" w:hAnsi="Times New Roman"/>
-        </w:rPr>
-        <w:t xml:space="preserve">Indicadores de impacto não preenchidos. Consulte o Manual UFLA 6ª ed. p. 51 para orientações sobre este elemento obrigatório.</w:t>
-      </w:r>
-    </w:p>
-    <w:p>
-      <w:r>
-        <w:br w:type="page"/>
-      </w:r>
-    </w:p>
-    <w:p>
-      <w:pPr>
-        <w:spacing w:before="240" w:after="240" w:line="360"/>
+        <w:pStyle w:val="ufla_titulo_sem_indicativo"/>
+        <w:spacing w:before="240" w:after="240" w:line="240"/>
         <w:jc w:val="center"/>
       </w:pPr>
       <w:r>
@@ -602,7 +605,7 @@
     </w:p>
     <w:p>
       <w:pPr>
-        <w:pStyle w:val="Heading1"/>
+        <w:pStyle w:val="ufla_titulo_primario"/>
         <w:spacing w:before="240" w:after="240" w:line="360"/>
         <w:jc w:val="left"/>
       </w:pPr>
@@ -641,7 +644,7 @@
     </w:p>
     <w:p>
       <w:pPr>
-        <w:pStyle w:val="Heading1"/>
+        <w:pStyle w:val="ufla_titulo_primario"/>
         <w:spacing w:before="240" w:after="240" w:line="360"/>
         <w:jc w:val="left"/>
       </w:pPr>
@@ -680,7 +683,7 @@
     </w:p>
     <w:p>
       <w:pPr>
-        <w:pStyle w:val="Heading1"/>
+        <w:pStyle w:val="ufla_titulo_primario"/>
         <w:spacing w:before="240" w:after="240" w:line="360"/>
         <w:jc w:val="left"/>
       </w:pPr>
@@ -719,7 +722,7 @@
     </w:p>
     <w:p>
       <w:pPr>
-        <w:pStyle w:val="Heading1"/>
+        <w:pStyle w:val="ufla_titulo_primario"/>
         <w:spacing w:before="240" w:after="240" w:line="360"/>
         <w:jc w:val="left"/>
       </w:pPr>
@@ -758,7 +761,7 @@
     </w:p>
     <w:p>
       <w:pPr>
-        <w:pStyle w:val="Heading1"/>
+        <w:pStyle w:val="ufla_titulo_sem_indicativo"/>
         <w:spacing w:before="240" w:after="240" w:line="360"/>
         <w:jc w:val="center"/>
       </w:pPr>
@@ -776,6 +779,7 @@
     </w:p>
     <w:p>
       <w:pPr>
+        <w:pStyle w:val="ufla_referencia"/>
         <w:spacing w:line="240" w:after="240"/>
         <w:ind w:left="284" w:hanging="284"/>
         <w:jc w:val="left"/>
@@ -812,6 +816,7 @@
     </w:p>
     <w:p>
       <w:pPr>
+        <w:pStyle w:val="ufla_referencia"/>
         <w:spacing w:line="240" w:after="240"/>
         <w:ind w:left="284" w:hanging="284"/>
         <w:jc w:val="left"/>
@@ -848,6 +853,7 @@
     </w:p>
     <w:p>
       <w:pPr>
+        <w:pStyle w:val="ufla_referencia"/>
         <w:spacing w:line="240" w:after="240"/>
         <w:ind w:left="284" w:hanging="284"/>
         <w:jc w:val="left"/>
@@ -884,6 +890,7 @@
     </w:p>
     <w:p>
       <w:pPr>
+        <w:pStyle w:val="ufla_referencia"/>
         <w:spacing w:line="240" w:after="240"/>
         <w:ind w:left="284" w:hanging="284"/>
         <w:jc w:val="left"/>
@@ -925,7 +932,7 @@
     </w:p>
     <w:p>
       <w:pPr>
-        <w:pStyle w:val="Heading1"/>
+        <w:pStyle w:val="ufla_apendice_titulo"/>
         <w:spacing w:before="240" w:after="240" w:line="360"/>
         <w:jc w:val="center"/>
       </w:pPr>
@@ -943,6 +950,7 @@
     </w:p>
     <w:p>
       <w:pPr>
+        <w:pStyle w:val="ufla_corpo_texto"/>
         <w:spacing w:line="240" w:after="0"/>
         <w:jc w:val="both"/>
       </w:pPr>
@@ -963,7 +971,7 @@
     </w:p>
     <w:p>
       <w:pPr>
-        <w:pStyle w:val="Heading1"/>
+        <w:pStyle w:val="ufla_anexo_titulo"/>
         <w:spacing w:before="240" w:after="240" w:line="360"/>
         <w:jc w:val="center"/>
       </w:pPr>
@@ -981,6 +989,7 @@
     </w:p>
     <w:p>
       <w:pPr>
+        <w:pStyle w:val="ufla_corpo_texto"/>
         <w:spacing w:line="240" w:after="0"/>
         <w:jc w:val="both"/>
       </w:pPr>
@@ -998,7 +1007,7 @@
       <w:headerReference w:type="default" r:id="rId6"/>
       <w:pgSz w:w="11906" w:h="16838" w:orient="portrait"/>
       <w:pgMar w:top="1701" w:right="1134" w:bottom="1134" w:left="1701" w:header="1134" w:footer="1134" w:gutter="0"/>
-      <w:pgNumType w:start="1"/>
+      <w:pgNumType w:start="7"/>
       <w:docGrid w:linePitch="360"/>
     </w:sectPr>
   </w:body>
@@ -1405,5 +1414,481 @@
       <w:rFonts w:ascii="Times New Roman" w:cs="Times New Roman" w:eastAsia="Times New Roman" w:hAnsi="Times New Roman"/>
     </w:rPr>
   </w:style>
+  <w:style w:type="paragraph" w:styleId="ufla_capa_autor">
+    <w:name w:val="Capa — autor (UFLA)"/>
+    <w:basedOn w:val="Normal"/>
+    <w:next w:val="Normal"/>
+    <w:qFormat/>
+    <w:pPr>
+      <w:spacing w:line="240"/>
+      <w:jc w:val="center"/>
+    </w:pPr>
+    <w:rPr>
+      <w:b/>
+      <w:bCs/>
+      <w:color w:val="000000"/>
+      <w:sz w:val="28"/>
+      <w:szCs w:val="28"/>
+      <w:rFonts w:ascii="Times New Roman" w:cs="Times New Roman" w:eastAsia="Times New Roman" w:hAnsi="Times New Roman"/>
+    </w:rPr>
+  </w:style>
+  <w:style w:type="paragraph" w:styleId="ufla_capa_titulo">
+    <w:name w:val="Capa — título (UFLA)"/>
+    <w:basedOn w:val="Normal"/>
+    <w:next w:val="Normal"/>
+    <w:qFormat/>
+    <w:pPr>
+      <w:spacing w:line="360"/>
+      <w:jc w:val="center"/>
+    </w:pPr>
+    <w:rPr>
+      <w:b/>
+      <w:bCs/>
+      <w:color w:val="000000"/>
+      <w:sz w:val="32"/>
+      <w:szCs w:val="32"/>
+      <w:rFonts w:ascii="Times New Roman" w:cs="Times New Roman" w:eastAsia="Times New Roman" w:hAnsi="Times New Roman"/>
+    </w:rPr>
+  </w:style>
+  <w:style w:type="paragraph" w:styleId="ufla_capa_subtitulo">
+    <w:name w:val="Capa — subtítulo (UFLA)"/>
+    <w:basedOn w:val="Normal"/>
+    <w:next w:val="Normal"/>
+    <w:qFormat/>
+    <w:pPr>
+      <w:spacing w:line="360"/>
+      <w:jc w:val="center"/>
+    </w:pPr>
+    <w:rPr>
+      <w:b w:val="false"/>
+      <w:bCs w:val="false"/>
+      <w:color w:val="000000"/>
+      <w:sz w:val="32"/>
+      <w:szCs w:val="32"/>
+      <w:rFonts w:ascii="Times New Roman" w:cs="Times New Roman" w:eastAsia="Times New Roman" w:hAnsi="Times New Roman"/>
+    </w:rPr>
+  </w:style>
+  <w:style w:type="paragraph" w:styleId="ufla_capa_local_ano">
+    <w:name w:val="Capa — local e ano (UFLA)"/>
+    <w:basedOn w:val="Normal"/>
+    <w:next w:val="Normal"/>
+    <w:qFormat/>
+    <w:pPr>
+      <w:spacing w:line="240"/>
+      <w:jc w:val="center"/>
+    </w:pPr>
+    <w:rPr>
+      <w:b/>
+      <w:bCs/>
+      <w:color w:val="000000"/>
+      <w:sz w:val="28"/>
+      <w:szCs w:val="28"/>
+      <w:rFonts w:ascii="Times New Roman" w:cs="Times New Roman" w:eastAsia="Times New Roman" w:hAnsi="Times New Roman"/>
+    </w:rPr>
+  </w:style>
+  <w:style w:type="paragraph" w:styleId="ufla_folha_rosto_autor">
+    <w:name w:val="Folha de rosto — autor (UFLA)"/>
+    <w:basedOn w:val="Normal"/>
+    <w:next w:val="Normal"/>
+    <w:qFormat/>
+    <w:pPr>
+      <w:spacing w:line="240"/>
+      <w:jc w:val="center"/>
+    </w:pPr>
+    <w:rPr>
+      <w:b/>
+      <w:bCs/>
+      <w:color w:val="000000"/>
+      <w:sz w:val="28"/>
+      <w:szCs w:val="28"/>
+      <w:rFonts w:ascii="Times New Roman" w:cs="Times New Roman" w:eastAsia="Times New Roman" w:hAnsi="Times New Roman"/>
+    </w:rPr>
+  </w:style>
+  <w:style w:type="paragraph" w:styleId="ufla_folha_rosto_titulo">
+    <w:name w:val="Folha de rosto — título (UFLA)"/>
+    <w:basedOn w:val="Normal"/>
+    <w:next w:val="Normal"/>
+    <w:qFormat/>
+    <w:pPr>
+      <w:spacing w:line="360"/>
+      <w:jc w:val="center"/>
+    </w:pPr>
+    <w:rPr>
+      <w:b/>
+      <w:bCs/>
+      <w:color w:val="000000"/>
+      <w:sz w:val="24"/>
+      <w:szCs w:val="24"/>
+      <w:rFonts w:ascii="Times New Roman" w:cs="Times New Roman" w:eastAsia="Times New Roman" w:hAnsi="Times New Roman"/>
+    </w:rPr>
+  </w:style>
+  <w:style w:type="paragraph" w:styleId="ufla_natureza">
+    <w:name w:val="Folha de rosto — natureza do trabalho (UFLA)"/>
+    <w:basedOn w:val="Normal"/>
+    <w:next w:val="Normal"/>
+    <w:qFormat/>
+    <w:pPr>
+      <w:spacing w:line="240" w:after="180"/>
+      <w:ind w:left="2268"/>
+      <w:jc w:val="both"/>
+    </w:pPr>
+    <w:rPr>
+      <w:color w:val="000000"/>
+      <w:sz w:val="24"/>
+      <w:szCs w:val="24"/>
+      <w:rFonts w:ascii="Times New Roman" w:cs="Times New Roman" w:eastAsia="Times New Roman" w:hAnsi="Times New Roman"/>
+    </w:rPr>
+  </w:style>
+  <w:style w:type="paragraph" w:styleId="ufla_titulo_sem_indicativo">
+    <w:name w:val="Título sem indicativo numérico (UFLA)"/>
+    <w:basedOn w:val="Heading1"/>
+    <w:next w:val="Normal"/>
+    <w:qFormat/>
+    <w:pPr>
+      <w:spacing w:before="240" w:after="240" w:line="360"/>
+      <w:jc w:val="center"/>
+      <w:outlineLvl w:val="0"/>
+    </w:pPr>
+    <w:rPr>
+      <w:b/>
+      <w:bCs/>
+      <w:color w:val="000000"/>
+      <w:sz w:val="24"/>
+      <w:szCs w:val="24"/>
+      <w:rFonts w:ascii="Times New Roman" w:cs="Times New Roman" w:eastAsia="Times New Roman" w:hAnsi="Times New Roman"/>
+    </w:rPr>
+  </w:style>
+  <w:style w:type="paragraph" w:styleId="ufla_titulo_primario">
+    <w:name w:val="Título de seção primária (UFLA)"/>
+    <w:basedOn w:val="Heading1"/>
+    <w:next w:val="Normal"/>
+    <w:qFormat/>
+    <w:pPr>
+      <w:spacing w:before="240" w:after="240" w:line="360"/>
+      <w:jc w:val="left"/>
+      <w:outlineLvl w:val="0"/>
+    </w:pPr>
+    <w:rPr>
+      <w:b/>
+      <w:bCs/>
+      <w:color w:val="000000"/>
+      <w:sz w:val="24"/>
+      <w:szCs w:val="24"/>
+      <w:rFonts w:ascii="Times New Roman" w:cs="Times New Roman" w:eastAsia="Times New Roman" w:hAnsi="Times New Roman"/>
+    </w:rPr>
+  </w:style>
+  <w:style w:type="paragraph" w:styleId="ufla_titulo_secundario">
+    <w:name w:val="Título de seção secundária (UFLA)"/>
+    <w:basedOn w:val="Heading2"/>
+    <w:next w:val="Normal"/>
+    <w:qFormat/>
+    <w:pPr>
+      <w:spacing w:before="240" w:after="240" w:line="360"/>
+      <w:jc w:val="left"/>
+      <w:outlineLvl w:val="1"/>
+    </w:pPr>
+    <w:rPr>
+      <w:b/>
+      <w:bCs/>
+      <w:color w:val="000000"/>
+      <w:sz w:val="24"/>
+      <w:szCs w:val="24"/>
+      <w:rFonts w:ascii="Times New Roman" w:cs="Times New Roman" w:eastAsia="Times New Roman" w:hAnsi="Times New Roman"/>
+    </w:rPr>
+  </w:style>
+  <w:style w:type="paragraph" w:styleId="ufla_titulo_terciario">
+    <w:name w:val="Título de seção terciária (UFLA)"/>
+    <w:basedOn w:val="Heading3"/>
+    <w:next w:val="Normal"/>
+    <w:qFormat/>
+    <w:pPr>
+      <w:spacing w:before="240" w:after="240" w:line="360"/>
+      <w:jc w:val="left"/>
+      <w:outlineLvl w:val="2"/>
+    </w:pPr>
+    <w:rPr>
+      <w:b/>
+      <w:bCs/>
+      <w:color w:val="000000"/>
+      <w:sz w:val="24"/>
+      <w:szCs w:val="24"/>
+      <w:rFonts w:ascii="Times New Roman" w:cs="Times New Roman" w:eastAsia="Times New Roman" w:hAnsi="Times New Roman"/>
+    </w:rPr>
+  </w:style>
+  <w:style w:type="paragraph" w:styleId="ufla_corpo_texto">
+    <w:name w:val="Corpo de texto (UFLA)"/>
+    <w:basedOn w:val="Normal"/>
+    <w:next w:val="Normal"/>
+    <w:qFormat/>
+    <w:pPr>
+      <w:spacing w:line="360" w:after="0"/>
+      <w:ind w:firstLine="709"/>
+      <w:jc w:val="both"/>
+    </w:pPr>
+    <w:rPr>
+      <w:color w:val="000000"/>
+      <w:sz w:val="24"/>
+      <w:szCs w:val="24"/>
+      <w:rFonts w:ascii="Times New Roman" w:cs="Times New Roman" w:eastAsia="Times New Roman" w:hAnsi="Times New Roman"/>
+    </w:rPr>
+  </w:style>
+  <w:style w:type="paragraph" w:styleId="ufla_citacao_curta">
+    <w:name w:val="Citação direta curta (UFLA)"/>
+    <w:basedOn w:val="ufla_corpo_texto"/>
+    <w:next w:val="Normal"/>
+    <w:qFormat/>
+    <w:pPr>
+      <w:spacing w:line="360" w:after="0"/>
+      <w:ind w:firstLine="709"/>
+      <w:jc w:val="both"/>
+    </w:pPr>
+    <w:rPr>
+      <w:color w:val="000000"/>
+      <w:sz w:val="24"/>
+      <w:szCs w:val="24"/>
+      <w:rFonts w:ascii="Times New Roman" w:cs="Times New Roman" w:eastAsia="Times New Roman" w:hAnsi="Times New Roman"/>
+    </w:rPr>
+  </w:style>
+  <w:style w:type="paragraph" w:styleId="ufla_citacao_longa">
+    <w:name w:val="Citação direta longa (UFLA)"/>
+    <w:basedOn w:val="Normal"/>
+    <w:next w:val="Normal"/>
+    <w:qFormat/>
+    <w:pPr>
+      <w:spacing w:line="240" w:after="120"/>
+      <w:ind w:left="2268"/>
+      <w:jc w:val="both"/>
+    </w:pPr>
+    <w:rPr>
+      <w:color w:val="000000"/>
+      <w:sz w:val="22"/>
+      <w:szCs w:val="22"/>
+      <w:rFonts w:ascii="Times New Roman" w:cs="Times New Roman" w:eastAsia="Times New Roman" w:hAnsi="Times New Roman"/>
+    </w:rPr>
+  </w:style>
+  <w:style w:type="paragraph" w:styleId="ufla_resumo">
+    <w:name w:val="Resumo (UFLA)"/>
+    <w:basedOn w:val="Normal"/>
+    <w:next w:val="Normal"/>
+    <w:qFormat/>
+    <w:pPr>
+      <w:spacing w:line="240" w:after="0"/>
+      <w:jc w:val="both"/>
+    </w:pPr>
+    <w:rPr>
+      <w:color w:val="000000"/>
+      <w:sz w:val="24"/>
+      <w:szCs w:val="24"/>
+      <w:rFonts w:ascii="Times New Roman" w:cs="Times New Roman" w:eastAsia="Times New Roman" w:hAnsi="Times New Roman"/>
+    </w:rPr>
+  </w:style>
+  <w:style w:type="paragraph" w:styleId="ufla_palavras_chave">
+    <w:name w:val="Palavras-chave (UFLA)"/>
+    <w:basedOn w:val="ufla_resumo"/>
+    <w:next w:val="Normal"/>
+    <w:qFormat/>
+    <w:pPr>
+      <w:spacing w:line="360" w:after="0"/>
+      <w:jc w:val="both"/>
+    </w:pPr>
+    <w:rPr>
+      <w:color w:val="000000"/>
+      <w:sz w:val="24"/>
+      <w:szCs w:val="24"/>
+      <w:rFonts w:ascii="Times New Roman" w:cs="Times New Roman" w:eastAsia="Times New Roman" w:hAnsi="Times New Roman"/>
+    </w:rPr>
+  </w:style>
+  <w:style w:type="paragraph" w:styleId="ufla_abstract">
+    <w:name w:val="Abstract (UFLA)"/>
+    <w:basedOn w:val="ufla_resumo"/>
+    <w:next w:val="Normal"/>
+    <w:qFormat/>
+    <w:pPr>
+      <w:spacing w:line="240" w:after="0"/>
+      <w:jc w:val="both"/>
+    </w:pPr>
+    <w:rPr>
+      <w:color w:val="000000"/>
+      <w:sz w:val="24"/>
+      <w:szCs w:val="24"/>
+      <w:rFonts w:ascii="Times New Roman" w:cs="Times New Roman" w:eastAsia="Times New Roman" w:hAnsi="Times New Roman"/>
+    </w:rPr>
+  </w:style>
+  <w:style w:type="paragraph" w:styleId="ufla_keywords">
+    <w:name w:val="Keywords (UFLA)"/>
+    <w:basedOn w:val="ufla_palavras_chave"/>
+    <w:next w:val="Normal"/>
+    <w:qFormat/>
+    <w:pPr>
+      <w:spacing w:line="360" w:after="0"/>
+      <w:jc w:val="both"/>
+    </w:pPr>
+    <w:rPr>
+      <w:color w:val="000000"/>
+      <w:sz w:val="24"/>
+      <w:szCs w:val="24"/>
+      <w:rFonts w:ascii="Times New Roman" w:cs="Times New Roman" w:eastAsia="Times New Roman" w:hAnsi="Times New Roman"/>
+    </w:rPr>
+  </w:style>
+  <w:style w:type="paragraph" w:styleId="ufla_referencia">
+    <w:name w:val="Referência bibliográfica (UFLA)"/>
+    <w:basedOn w:val="Normal"/>
+    <w:next w:val="Normal"/>
+    <w:qFormat/>
+    <w:pPr>
+      <w:spacing w:line="240" w:after="240"/>
+      <w:ind w:left="284" w:hanging="284"/>
+      <w:jc w:val="left"/>
+    </w:pPr>
+    <w:rPr>
+      <w:color w:val="000000"/>
+      <w:sz w:val="24"/>
+      <w:szCs w:val="24"/>
+      <w:rFonts w:ascii="Times New Roman" w:cs="Times New Roman" w:eastAsia="Times New Roman" w:hAnsi="Times New Roman"/>
+    </w:rPr>
+  </w:style>
+  <w:style w:type="paragraph" w:styleId="ufla_legenda_ilustracao">
+    <w:name w:val="Legenda de ilustração (UFLA)"/>
+    <w:basedOn w:val="Normal"/>
+    <w:next w:val="Normal"/>
+    <w:qFormat/>
+    <w:pPr>
+      <w:spacing w:before="120" w:after="120" w:line="240"/>
+      <w:ind w:left="454" w:right="454"/>
+      <w:jc w:val="center"/>
+    </w:pPr>
+    <w:rPr>
+      <w:b/>
+      <w:bCs/>
+      <w:color w:val="000000"/>
+      <w:sz w:val="24"/>
+      <w:szCs w:val="24"/>
+      <w:rFonts w:ascii="Times New Roman" w:cs="Times New Roman" w:eastAsia="Times New Roman" w:hAnsi="Times New Roman"/>
+    </w:rPr>
+  </w:style>
+  <w:style w:type="paragraph" w:styleId="ufla_fonte_ilustracao">
+    <w:name w:val="Fonte de ilustração (UFLA)"/>
+    <w:basedOn w:val="Normal"/>
+    <w:next w:val="Normal"/>
+    <w:qFormat/>
+    <w:pPr>
+      <w:spacing w:before="60" w:after="120" w:line="240"/>
+      <w:ind w:left="454" w:right="454"/>
+      <w:jc w:val="left"/>
+    </w:pPr>
+    <w:rPr>
+      <w:color w:val="000000"/>
+      <w:sz w:val="22"/>
+      <w:szCs w:val="22"/>
+      <w:rFonts w:ascii="Times New Roman" w:cs="Times New Roman" w:eastAsia="Times New Roman" w:hAnsi="Times New Roman"/>
+    </w:rPr>
+  </w:style>
+  <w:style w:type="paragraph" w:styleId="ufla_legenda_tabela">
+    <w:name w:val="Legenda de tabela (UFLA)"/>
+    <w:basedOn w:val="Normal"/>
+    <w:next w:val="Normal"/>
+    <w:qFormat/>
+    <w:pPr>
+      <w:spacing w:before="120" w:after="120" w:line="240"/>
+      <w:ind w:left="454" w:right="454"/>
+      <w:jc w:val="center"/>
+    </w:pPr>
+    <w:rPr>
+      <w:b/>
+      <w:bCs/>
+      <w:color w:val="000000"/>
+      <w:sz w:val="24"/>
+      <w:szCs w:val="24"/>
+      <w:rFonts w:ascii="Times New Roman" w:cs="Times New Roman" w:eastAsia="Times New Roman" w:hAnsi="Times New Roman"/>
+    </w:rPr>
+  </w:style>
+  <w:style w:type="paragraph" w:styleId="ufla_fonte_tabela">
+    <w:name w:val="Fonte de tabela (UFLA)"/>
+    <w:basedOn w:val="Normal"/>
+    <w:next w:val="Normal"/>
+    <w:qFormat/>
+    <w:pPr>
+      <w:spacing w:before="60" w:after="120" w:line="240"/>
+      <w:ind w:left="454" w:right="454"/>
+      <w:jc w:val="left"/>
+    </w:pPr>
+    <w:rPr>
+      <w:color w:val="000000"/>
+      <w:sz w:val="22"/>
+      <w:szCs w:val="22"/>
+      <w:rFonts w:ascii="Times New Roman" w:cs="Times New Roman" w:eastAsia="Times New Roman" w:hAnsi="Times New Roman"/>
+    </w:rPr>
+  </w:style>
+  <w:style w:type="paragraph" w:styleId="ufla_sumario_item">
+    <w:name w:val="Item de sumário (UFLA)"/>
+    <w:basedOn w:val="TOC1"/>
+    <w:next w:val="Normal"/>
+    <w:qFormat/>
+    <w:pPr>
+      <w:spacing w:line="240"/>
+      <w:jc w:val="left"/>
+    </w:pPr>
+    <w:rPr>
+      <w:color w:val="000000"/>
+      <w:sz w:val="24"/>
+      <w:szCs w:val="24"/>
+      <w:rFonts w:ascii="Times New Roman" w:cs="Times New Roman" w:eastAsia="Times New Roman" w:hAnsi="Times New Roman"/>
+    </w:rPr>
+  </w:style>
+  <w:style w:type="paragraph" w:styleId="ufla_lista_item">
+    <w:name w:val="Item de lista de ilustrações/tabelas (UFLA)"/>
+    <w:basedOn w:val="Normal"/>
+    <w:next w:val="Normal"/>
+    <w:qFormat/>
+    <w:pPr>
+      <w:spacing w:line="240" w:after="120"/>
+      <w:ind w:left="709" w:hanging="709"/>
+      <w:jc w:val="left"/>
+    </w:pPr>
+    <w:rPr>
+      <w:color w:val="000000"/>
+      <w:sz w:val="24"/>
+      <w:szCs w:val="24"/>
+      <w:rFonts w:ascii="Times New Roman" w:cs="Times New Roman" w:eastAsia="Times New Roman" w:hAnsi="Times New Roman"/>
+    </w:rPr>
+  </w:style>
+  <w:style w:type="paragraph" w:styleId="ufla_anexo_titulo">
+    <w:name w:val="Título de Anexo (UFLA)"/>
+    <w:basedOn w:val="ufla_titulo_sem_indicativo"/>
+    <w:next w:val="Normal"/>
+    <w:qFormat/>
+    <w:pPr>
+      <w:spacing w:before="240" w:after="240" w:line="360"/>
+      <w:jc w:val="center"/>
+      <w:outlineLvl w:val="0"/>
+    </w:pPr>
+    <w:rPr>
+      <w:b/>
+      <w:bCs/>
+      <w:color w:val="000000"/>
+      <w:sz w:val="24"/>
+      <w:szCs w:val="24"/>
+      <w:rFonts w:ascii="Times New Roman" w:cs="Times New Roman" w:eastAsia="Times New Roman" w:hAnsi="Times New Roman"/>
+    </w:rPr>
+  </w:style>
+  <w:style w:type="paragraph" w:styleId="ufla_apendice_titulo">
+    <w:name w:val="Título de Apêndice (UFLA)"/>
+    <w:basedOn w:val="ufla_titulo_sem_indicativo"/>
+    <w:next w:val="Normal"/>
+    <w:qFormat/>
+    <w:pPr>
+      <w:spacing w:before="240" w:after="240" w:line="360"/>
+      <w:jc w:val="center"/>
+      <w:outlineLvl w:val="0"/>
+    </w:pPr>
+    <w:rPr>
+      <w:b/>
+      <w:bCs/>
+      <w:color w:val="000000"/>
+      <w:sz w:val="24"/>
+      <w:szCs w:val="24"/>
+      <w:rFonts w:ascii="Times New Roman" w:cs="Times New Roman" w:eastAsia="Times New Roman" w:hAnsi="Times New Roman"/>
+    </w:rPr>
+  </w:style>
 </w:styles>
 </file>
</xml_diff>